<commit_message>
add src for js exercises
</commit_message>
<xml_diff>
--- a/Reports/گزارش روزانه.docx
+++ b/Reports/گزارش روزانه.docx
@@ -76,8 +76,6 @@
         </w:rPr>
         <w:t xml:space="preserve"> </w:t>
       </w:r>
-      <w:bookmarkStart w:id="0" w:name="_GoBack"/>
-      <w:bookmarkEnd w:id="0"/>
       <w:r>
         <w:rPr>
           <w:rFonts w:hint="cs"/>
@@ -1433,6 +1431,49 @@
           <w:lang w:bidi="fa-IR"/>
         </w:rPr>
         <w:t>)</w:t>
+      </w:r>
+    </w:p>
+    <w:p>
+      <w:pPr>
+        <w:pBdr>
+          <w:bottom w:val="single" w:sz="6" w:space="1" w:color="auto"/>
+        </w:pBdr>
+        <w:bidi/>
+        <w:jc w:val="left"/>
+        <w:rPr>
+          <w:rFonts w:asciiTheme="minorHAnsi" w:hAnsiTheme="minorHAnsi"/>
+          <w:rtl/>
+          <w:lang w:bidi="fa-IR"/>
+        </w:rPr>
+      </w:pPr>
+    </w:p>
+    <w:p>
+      <w:pPr>
+        <w:bidi/>
+        <w:jc w:val="left"/>
+        <w:rPr>
+          <w:rFonts w:asciiTheme="minorHAnsi" w:hAnsiTheme="minorHAnsi"/>
+          <w:rtl/>
+          <w:lang w:bidi="fa-IR"/>
+        </w:rPr>
+      </w:pPr>
+      <w:r>
+        <w:rPr>
+          <w:rFonts w:asciiTheme="minorHAnsi" w:hAnsiTheme="minorHAnsi" w:hint="cs"/>
+          <w:rtl/>
+          <w:lang w:bidi="fa-IR"/>
+        </w:rPr>
+        <w:t>(یکشنبه)</w:t>
+      </w:r>
+      <w:bookmarkStart w:id="0" w:name="_GoBack"/>
+      <w:bookmarkEnd w:id="0"/>
+      <w:r>
+        <w:rPr>
+          <w:rFonts w:asciiTheme="minorHAnsi" w:hAnsiTheme="minorHAnsi" w:hint="cs"/>
+          <w:rtl/>
+          <w:lang w:bidi="fa-IR"/>
+        </w:rPr>
+        <w:t>روز چهاردهم</w:t>
       </w:r>
     </w:p>
     <w:p>

</xml_diff>